<commit_message>
comentados todos los validator para que compilen los formularios
</commit_message>
<xml_diff>
--- a/TPINT_GRUPO_2_PR3_Version7.docx
+++ b/TPINT_GRUPO_2_PR3_Version7.docx
@@ -190,7 +190,7 @@
     </w:p>
     <w:p>
       <w:pPr>
-        <w:pStyle w:val="Heading1"/>
+        <w:pStyle w:val="Ttulo1"/>
       </w:pPr>
       <w:bookmarkStart w:id="0" w:name="_7kjyku3q1xnh" w:colFirst="0" w:colLast="0"/>
       <w:bookmarkStart w:id="1" w:name="_Toc213490194"/>
@@ -203,6 +203,13 @@
     </w:p>
     <w:sdt>
       <w:sdtPr>
+        <w:rPr>
+          <w:rFonts w:ascii="Lato" w:eastAsia="Lato" w:hAnsi="Lato" w:cs="Lato"/>
+          <w:color w:val="auto"/>
+          <w:sz w:val="24"/>
+          <w:szCs w:val="24"/>
+          <w:lang w:val="es"/>
+        </w:rPr>
         <w:id w:val="588592710"/>
         <w:docPartObj>
           <w:docPartGallery w:val="Table of Contents"/>
@@ -211,20 +218,15 @@
       </w:sdtPr>
       <w:sdtEndPr>
         <w:rPr>
-          <w:rFonts w:ascii="Lato" w:eastAsia="Lato" w:hAnsi="Lato" w:cs="Lato"/>
           <w:b/>
           <w:bCs/>
           <w:noProof/>
-          <w:color w:val="auto"/>
-          <w:sz w:val="24"/>
-          <w:szCs w:val="24"/>
-          <w:lang w:val="es"/>
         </w:rPr>
       </w:sdtEndPr>
       <w:sdtContent>
         <w:p>
           <w:pPr>
-            <w:pStyle w:val="TOCHeading"/>
+            <w:pStyle w:val="TtuloTDC"/>
           </w:pPr>
           <w:r>
             <w:t>Contents</w:t>
@@ -232,7 +234,7 @@
         </w:p>
         <w:p>
           <w:pPr>
-            <w:pStyle w:val="TOC1"/>
+            <w:pStyle w:val="TDC1"/>
             <w:tabs>
               <w:tab w:val="right" w:leader="dot" w:pos="9019"/>
             </w:tabs>
@@ -252,7 +254,7 @@
           <w:hyperlink w:anchor="_Toc213490194" w:history="1">
             <w:r>
               <w:rPr>
-                <w:rStyle w:val="Hyperlink"/>
+                <w:rStyle w:val="Hipervnculo"/>
                 <w:noProof/>
               </w:rPr>
               <w:t>Índice</w:t>
@@ -309,7 +311,7 @@
         </w:p>
         <w:p>
           <w:pPr>
-            <w:pStyle w:val="TOC1"/>
+            <w:pStyle w:val="TDC1"/>
             <w:tabs>
               <w:tab w:val="right" w:leader="dot" w:pos="9019"/>
             </w:tabs>
@@ -320,7 +322,7 @@
           <w:hyperlink w:anchor="_Toc213490195" w:history="1">
             <w:r>
               <w:rPr>
-                <w:rStyle w:val="Hyperlink"/>
+                <w:rStyle w:val="Hipervnculo"/>
                 <w:noProof/>
               </w:rPr>
               <w:t>DER</w:t>
@@ -377,7 +379,7 @@
         </w:p>
         <w:p>
           <w:pPr>
-            <w:pStyle w:val="TOC1"/>
+            <w:pStyle w:val="TDC1"/>
             <w:tabs>
               <w:tab w:val="right" w:leader="dot" w:pos="9019"/>
             </w:tabs>
@@ -388,7 +390,7 @@
           <w:hyperlink w:anchor="_Toc213490196" w:history="1">
             <w:r>
               <w:rPr>
-                <w:rStyle w:val="Hyperlink"/>
+                <w:rStyle w:val="Hipervnculo"/>
                 <w:noProof/>
                 <w:lang w:val="es-ES"/>
               </w:rPr>
@@ -446,7 +448,7 @@
         </w:p>
         <w:p>
           <w:pPr>
-            <w:pStyle w:val="TOC1"/>
+            <w:pStyle w:val="TDC1"/>
             <w:tabs>
               <w:tab w:val="right" w:leader="dot" w:pos="9019"/>
             </w:tabs>
@@ -457,7 +459,7 @@
           <w:hyperlink w:anchor="_Toc213490197" w:history="1">
             <w:r>
               <w:rPr>
-                <w:rStyle w:val="Hyperlink"/>
+                <w:rStyle w:val="Hipervnculo"/>
                 <w:noProof/>
               </w:rPr>
               <w:t>Menú Administrador</w:t>
@@ -514,7 +516,7 @@
         </w:p>
         <w:p>
           <w:pPr>
-            <w:pStyle w:val="TOC1"/>
+            <w:pStyle w:val="TDC1"/>
             <w:tabs>
               <w:tab w:val="right" w:leader="dot" w:pos="9019"/>
             </w:tabs>
@@ -525,7 +527,7 @@
           <w:hyperlink w:anchor="_Toc213490198" w:history="1">
             <w:r>
               <w:rPr>
-                <w:rStyle w:val="Hyperlink"/>
+                <w:rStyle w:val="Hipervnculo"/>
                 <w:noProof/>
               </w:rPr>
               <w:t>Administración de pacientes</w:t>
@@ -582,7 +584,7 @@
         </w:p>
         <w:p>
           <w:pPr>
-            <w:pStyle w:val="TOC2"/>
+            <w:pStyle w:val="TDC2"/>
             <w:tabs>
               <w:tab w:val="right" w:leader="dot" w:pos="9019"/>
             </w:tabs>
@@ -593,7 +595,7 @@
           <w:hyperlink w:anchor="_Toc213490199" w:history="1">
             <w:r>
               <w:rPr>
-                <w:rStyle w:val="Hyperlink"/>
+                <w:rStyle w:val="Hipervnculo"/>
                 <w:noProof/>
               </w:rPr>
               <w:t>Agregar paciente</w:t>
@@ -650,7 +652,7 @@
         </w:p>
         <w:p>
           <w:pPr>
-            <w:pStyle w:val="TOC2"/>
+            <w:pStyle w:val="TDC2"/>
             <w:tabs>
               <w:tab w:val="right" w:leader="dot" w:pos="9019"/>
             </w:tabs>
@@ -661,7 +663,7 @@
           <w:hyperlink w:anchor="_Toc213490200" w:history="1">
             <w:r>
               <w:rPr>
-                <w:rStyle w:val="Hyperlink"/>
+                <w:rStyle w:val="Hipervnculo"/>
                 <w:noProof/>
               </w:rPr>
               <w:t>Dar de baja paciente</w:t>
@@ -718,7 +720,7 @@
         </w:p>
         <w:p>
           <w:pPr>
-            <w:pStyle w:val="TOC2"/>
+            <w:pStyle w:val="TDC2"/>
             <w:tabs>
               <w:tab w:val="right" w:leader="dot" w:pos="9019"/>
             </w:tabs>
@@ -729,7 +731,7 @@
           <w:hyperlink w:anchor="_Toc213490201" w:history="1">
             <w:r>
               <w:rPr>
-                <w:rStyle w:val="Hyperlink"/>
+                <w:rStyle w:val="Hipervnculo"/>
                 <w:noProof/>
               </w:rPr>
               <w:t>Modificar datos de paciente</w:t>
@@ -786,7 +788,7 @@
         </w:p>
         <w:p>
           <w:pPr>
-            <w:pStyle w:val="TOC2"/>
+            <w:pStyle w:val="TDC2"/>
             <w:tabs>
               <w:tab w:val="right" w:leader="dot" w:pos="9019"/>
             </w:tabs>
@@ -797,7 +799,7 @@
           <w:hyperlink w:anchor="_Toc213490202" w:history="1">
             <w:r>
               <w:rPr>
-                <w:rStyle w:val="Hyperlink"/>
+                <w:rStyle w:val="Hipervnculo"/>
                 <w:noProof/>
               </w:rPr>
               <w:t>Listar pacientes</w:t>
@@ -854,7 +856,7 @@
         </w:p>
         <w:p>
           <w:pPr>
-            <w:pStyle w:val="TOC1"/>
+            <w:pStyle w:val="TDC1"/>
             <w:tabs>
               <w:tab w:val="right" w:leader="dot" w:pos="9019"/>
             </w:tabs>
@@ -865,7 +867,7 @@
           <w:hyperlink w:anchor="_Toc213490203" w:history="1">
             <w:r>
               <w:rPr>
-                <w:rStyle w:val="Hyperlink"/>
+                <w:rStyle w:val="Hipervnculo"/>
                 <w:noProof/>
               </w:rPr>
               <w:t>Administración de médicos</w:t>
@@ -922,7 +924,7 @@
         </w:p>
         <w:p>
           <w:pPr>
-            <w:pStyle w:val="TOC2"/>
+            <w:pStyle w:val="TDC2"/>
             <w:tabs>
               <w:tab w:val="right" w:leader="dot" w:pos="9019"/>
             </w:tabs>
@@ -933,7 +935,7 @@
           <w:hyperlink w:anchor="_Toc213490204" w:history="1">
             <w:r>
               <w:rPr>
-                <w:rStyle w:val="Hyperlink"/>
+                <w:rStyle w:val="Hipervnculo"/>
                 <w:noProof/>
               </w:rPr>
               <w:t>Agregar médico</w:t>
@@ -990,7 +992,7 @@
         </w:p>
         <w:p>
           <w:pPr>
-            <w:pStyle w:val="TOC2"/>
+            <w:pStyle w:val="TDC2"/>
             <w:tabs>
               <w:tab w:val="right" w:leader="dot" w:pos="9019"/>
             </w:tabs>
@@ -1001,7 +1003,7 @@
           <w:hyperlink w:anchor="_Toc213490205" w:history="1">
             <w:r>
               <w:rPr>
-                <w:rStyle w:val="Hyperlink"/>
+                <w:rStyle w:val="Hipervnculo"/>
                 <w:noProof/>
               </w:rPr>
               <w:t>Dar médicos de baja</w:t>
@@ -1058,7 +1060,7 @@
         </w:p>
         <w:p>
           <w:pPr>
-            <w:pStyle w:val="TOC2"/>
+            <w:pStyle w:val="TDC2"/>
             <w:tabs>
               <w:tab w:val="right" w:leader="dot" w:pos="9019"/>
             </w:tabs>
@@ -1069,7 +1071,7 @@
           <w:hyperlink w:anchor="_Toc213490206" w:history="1">
             <w:r>
               <w:rPr>
-                <w:rStyle w:val="Hyperlink"/>
+                <w:rStyle w:val="Hipervnculo"/>
                 <w:noProof/>
               </w:rPr>
               <w:t>Modificar médico</w:t>
@@ -1126,7 +1128,7 @@
         </w:p>
         <w:p>
           <w:pPr>
-            <w:pStyle w:val="TOC2"/>
+            <w:pStyle w:val="TDC2"/>
             <w:tabs>
               <w:tab w:val="right" w:leader="dot" w:pos="9019"/>
             </w:tabs>
@@ -1137,7 +1139,7 @@
           <w:hyperlink w:anchor="_Toc213490207" w:history="1">
             <w:r>
               <w:rPr>
-                <w:rStyle w:val="Hyperlink"/>
+                <w:rStyle w:val="Hipervnculo"/>
                 <w:noProof/>
               </w:rPr>
               <w:t>Listar médicos</w:t>
@@ -1194,7 +1196,7 @@
         </w:p>
         <w:p>
           <w:pPr>
-            <w:pStyle w:val="TOC2"/>
+            <w:pStyle w:val="TDC2"/>
             <w:tabs>
               <w:tab w:val="right" w:leader="dot" w:pos="9019"/>
             </w:tabs>
@@ -1205,7 +1207,7 @@
           <w:hyperlink w:anchor="_Toc213490208" w:history="1">
             <w:r>
               <w:rPr>
-                <w:rStyle w:val="Hyperlink"/>
+                <w:rStyle w:val="Hipervnculo"/>
                 <w:noProof/>
               </w:rPr>
               <w:t>Asignación de Turnos</w:t>
@@ -1262,7 +1264,7 @@
         </w:p>
         <w:p>
           <w:pPr>
-            <w:pStyle w:val="TOC2"/>
+            <w:pStyle w:val="TDC2"/>
             <w:tabs>
               <w:tab w:val="right" w:leader="dot" w:pos="9019"/>
             </w:tabs>
@@ -1273,7 +1275,7 @@
           <w:hyperlink w:anchor="_Toc213490209" w:history="1">
             <w:r>
               <w:rPr>
-                <w:rStyle w:val="Hyperlink"/>
+                <w:rStyle w:val="Hipervnculo"/>
                 <w:noProof/>
               </w:rPr>
               <w:t>Informes y Reportes</w:t>
@@ -1330,7 +1332,7 @@
         </w:p>
         <w:p>
           <w:pPr>
-            <w:pStyle w:val="TOC1"/>
+            <w:pStyle w:val="TDC1"/>
             <w:tabs>
               <w:tab w:val="right" w:leader="dot" w:pos="9019"/>
             </w:tabs>
@@ -1341,7 +1343,7 @@
           <w:hyperlink w:anchor="_Toc213490210" w:history="1">
             <w:r>
               <w:rPr>
-                <w:rStyle w:val="Hyperlink"/>
+                <w:rStyle w:val="Hipervnculo"/>
                 <w:noProof/>
               </w:rPr>
               <w:t>Menú Médico</w:t>
@@ -1398,7 +1400,7 @@
         </w:p>
         <w:p>
           <w:pPr>
-            <w:pStyle w:val="TOC2"/>
+            <w:pStyle w:val="TDC2"/>
             <w:tabs>
               <w:tab w:val="right" w:leader="dot" w:pos="9019"/>
             </w:tabs>
@@ -1409,7 +1411,7 @@
           <w:hyperlink w:anchor="_Toc213490211" w:history="1">
             <w:r>
               <w:rPr>
-                <w:rStyle w:val="Hyperlink"/>
+                <w:rStyle w:val="Hipervnculo"/>
                 <w:noProof/>
               </w:rPr>
               <w:t>Ver turnos asignados</w:t>
@@ -1466,7 +1468,7 @@
         </w:p>
         <w:p>
           <w:pPr>
-            <w:pStyle w:val="TOC2"/>
+            <w:pStyle w:val="TDC2"/>
             <w:tabs>
               <w:tab w:val="right" w:leader="dot" w:pos="9019"/>
             </w:tabs>
@@ -1477,7 +1479,7 @@
           <w:hyperlink w:anchor="_Toc213490212" w:history="1">
             <w:r>
               <w:rPr>
-                <w:rStyle w:val="Hyperlink"/>
+                <w:rStyle w:val="Hipervnculo"/>
                 <w:noProof/>
               </w:rPr>
               <w:t>Registrar Asistencias</w:t>
@@ -1552,7 +1554,7 @@
     </w:p>
     <w:p>
       <w:pPr>
-        <w:pStyle w:val="Heading1"/>
+        <w:pStyle w:val="Ttulo1"/>
       </w:pPr>
       <w:bookmarkStart w:id="2" w:name="_Toc213490195"/>
       <w:r>
@@ -1628,7 +1630,7 @@
     </w:p>
     <w:p>
       <w:pPr>
-        <w:pStyle w:val="Heading1"/>
+        <w:pStyle w:val="Ttulo1"/>
       </w:pPr>
       <w:bookmarkStart w:id="3" w:name="_Toc213490196"/>
       <w:r>
@@ -1807,7 +1809,7 @@
     </w:p>
     <w:p>
       <w:pPr>
-        <w:pStyle w:val="Heading1"/>
+        <w:pStyle w:val="Ttulo1"/>
       </w:pPr>
       <w:bookmarkStart w:id="4" w:name="_Toc213490197"/>
       <w:r>
@@ -1885,7 +1887,7 @@
     </w:p>
     <w:p>
       <w:pPr>
-        <w:pStyle w:val="Heading1"/>
+        <w:pStyle w:val="Ttulo1"/>
       </w:pPr>
       <w:bookmarkStart w:id="5" w:name="_Toc213490198"/>
       <w:r>
@@ -1902,7 +1904,7 @@
     </w:p>
     <w:p>
       <w:pPr>
-        <w:pStyle w:val="Heading2"/>
+        <w:pStyle w:val="Ttulo2"/>
       </w:pPr>
       <w:bookmarkStart w:id="6" w:name="_Toc213490199"/>
       <w:r>
@@ -1920,6 +1922,9 @@
     </w:p>
     <w:p>
       <w:r>
+        <w:rPr>
+          <w:noProof/>
+        </w:rPr>
         <w:drawing>
           <wp:inline distT="0" distB="0" distL="0" distR="0" wp14:anchorId="6D16570D" wp14:editId="30B223EC">
             <wp:extent cx="5506218" cy="5801535"/>
@@ -1964,7 +1969,7 @@
     </w:p>
     <w:p>
       <w:pPr>
-        <w:pStyle w:val="Heading2"/>
+        <w:pStyle w:val="Ttulo2"/>
       </w:pPr>
       <w:bookmarkStart w:id="7" w:name="_Toc213490200"/>
       <w:r>
@@ -1989,6 +1994,9 @@
     </w:p>
     <w:p>
       <w:r>
+        <w:rPr>
+          <w:noProof/>
+        </w:rPr>
         <w:drawing>
           <wp:inline distT="0" distB="0" distL="0" distR="0" wp14:anchorId="22FCB6BB" wp14:editId="4D0B885F">
             <wp:extent cx="5733415" cy="2322195"/>
@@ -2033,7 +2041,7 @@
     </w:p>
     <w:p>
       <w:pPr>
-        <w:pStyle w:val="Heading2"/>
+        <w:pStyle w:val="Ttulo2"/>
       </w:pPr>
       <w:bookmarkStart w:id="8" w:name="_Toc213490201"/>
       <w:r>
@@ -2052,6 +2060,9 @@
     </w:p>
     <w:p>
       <w:r>
+        <w:rPr>
+          <w:noProof/>
+        </w:rPr>
         <w:drawing>
           <wp:inline distT="0" distB="0" distL="0" distR="0" wp14:anchorId="4E8B31F5" wp14:editId="4AA838FF">
             <wp:extent cx="5733415" cy="5305425"/>
@@ -2096,7 +2107,7 @@
     </w:p>
     <w:p>
       <w:pPr>
-        <w:pStyle w:val="Heading2"/>
+        <w:pStyle w:val="Ttulo2"/>
       </w:pPr>
       <w:bookmarkStart w:id="9" w:name="_Toc213490202"/>
       <w:r>
@@ -2254,7 +2265,7 @@
     </w:p>
     <w:p>
       <w:pPr>
-        <w:pStyle w:val="Heading1"/>
+        <w:pStyle w:val="Ttulo1"/>
       </w:pPr>
       <w:bookmarkStart w:id="10" w:name="_Toc213490203"/>
       <w:r>
@@ -2268,7 +2279,7 @@
     </w:p>
     <w:p>
       <w:pPr>
-        <w:pStyle w:val="Heading2"/>
+        <w:pStyle w:val="Ttulo2"/>
       </w:pPr>
       <w:bookmarkStart w:id="11" w:name="_Toc213490204"/>
       <w:r>
@@ -2322,7 +2333,7 @@
           <w:noProof/>
         </w:rPr>
         <w:drawing>
-          <wp:inline distT="0" distB="0" distL="0" distR="0" wp14:anchorId="06244BB2" wp14:editId="3A7062BD">
+          <wp:inline distT="0" distB="0" distL="0" distR="0" wp14:anchorId="06244BB2" wp14:editId="77336A2A">
             <wp:extent cx="5732780" cy="2568575"/>
             <wp:effectExtent l="0" t="0" r="1270" b="3175"/>
             <wp:docPr id="1217024188" name="Imagen 9" descr="Tabla&#10;&#10;El contenido generado por IA puede ser incorrecto."/>
@@ -2389,7 +2400,7 @@
           <w:szCs w:val="40"/>
         </w:rPr>
         <w:drawing>
-          <wp:inline distT="0" distB="0" distL="0" distR="0" wp14:anchorId="7C959DD6" wp14:editId="4218548C">
+          <wp:inline distT="0" distB="0" distL="0" distR="0" wp14:anchorId="7C959DD6" wp14:editId="6E420E81">
             <wp:extent cx="5716905" cy="1415415"/>
             <wp:effectExtent l="0" t="0" r="0" b="0"/>
             <wp:docPr id="573616557" name="Imagen 10"/>
@@ -2453,7 +2464,7 @@
     </w:p>
     <w:p>
       <w:pPr>
-        <w:pStyle w:val="Heading2"/>
+        <w:pStyle w:val="Ttulo2"/>
       </w:pPr>
       <w:bookmarkStart w:id="12" w:name="_Toc213490205"/>
       <w:r>
@@ -2569,7 +2580,7 @@
           <w:noProof/>
         </w:rPr>
         <w:drawing>
-          <wp:inline distT="0" distB="0" distL="0" distR="0" wp14:anchorId="64D13D93" wp14:editId="2FCF6311">
+          <wp:inline distT="0" distB="0" distL="0" distR="0" wp14:anchorId="64D13D93" wp14:editId="7B686044">
             <wp:extent cx="5725160" cy="1788795"/>
             <wp:effectExtent l="0" t="0" r="8890" b="1905"/>
             <wp:docPr id="1519553807" name="Imagen 12"/>
@@ -2639,7 +2650,7 @@
     </w:p>
     <w:p>
       <w:pPr>
-        <w:pStyle w:val="Heading2"/>
+        <w:pStyle w:val="Ttulo2"/>
       </w:pPr>
       <w:bookmarkStart w:id="13" w:name="_Toc213490206"/>
       <w:r>
@@ -2792,7 +2803,7 @@
           <w:noProof/>
         </w:rPr>
         <w:drawing>
-          <wp:inline distT="0" distB="0" distL="0" distR="0" wp14:anchorId="4DB042B0" wp14:editId="2BF6A2C6">
+          <wp:inline distT="0" distB="0" distL="0" distR="0" wp14:anchorId="4DB042B0" wp14:editId="1EF01528">
             <wp:extent cx="5732780" cy="2814955"/>
             <wp:effectExtent l="0" t="0" r="1270" b="4445"/>
             <wp:docPr id="1420581770" name="Imagen 7"/>
@@ -2847,7 +2858,7 @@
           <w:noProof/>
         </w:rPr>
         <w:drawing>
-          <wp:inline distT="0" distB="0" distL="0" distR="0" wp14:anchorId="202DCBE8" wp14:editId="1D539E8F">
+          <wp:inline distT="0" distB="0" distL="0" distR="0" wp14:anchorId="202DCBE8" wp14:editId="3CD6FE8C">
             <wp:extent cx="5725160" cy="1447165"/>
             <wp:effectExtent l="0" t="0" r="8890" b="635"/>
             <wp:docPr id="1655434592" name="Imagen 13"/>
@@ -2903,7 +2914,7 @@
     </w:p>
     <w:p>
       <w:pPr>
-        <w:pStyle w:val="Heading2"/>
+        <w:pStyle w:val="Ttulo2"/>
       </w:pPr>
       <w:bookmarkStart w:id="14" w:name="_Toc213490207"/>
       <w:r>
@@ -3182,7 +3193,7 @@
     <w:p/>
     <w:p>
       <w:pPr>
-        <w:pStyle w:val="Heading2"/>
+        <w:pStyle w:val="Ttulo2"/>
       </w:pPr>
       <w:bookmarkStart w:id="15" w:name="_Toc213490208"/>
       <w:r>
@@ -3271,11 +3282,9 @@
       <w:r>
         <w:t xml:space="preserve"> se </w:t>
       </w:r>
-      <w:proofErr w:type="gramStart"/>
-      <w:r>
-        <w:t>enviaran</w:t>
-      </w:r>
-      <w:proofErr w:type="gramEnd"/>
+      <w:r>
+        <w:t>enviarán</w:t>
+      </w:r>
       <w:r>
         <w:t xml:space="preserve"> todos los datos y se comprobara que se pueda cargar el turno, esto será mostrado en el </w:t>
       </w:r>
@@ -3350,7 +3359,7 @@
     <w:p/>
     <w:p>
       <w:pPr>
-        <w:pStyle w:val="Heading2"/>
+        <w:pStyle w:val="Ttulo2"/>
       </w:pPr>
       <w:bookmarkStart w:id="16" w:name="_Toc213490209"/>
       <w:r>
@@ -3530,7 +3539,7 @@
     <w:p/>
     <w:p>
       <w:pPr>
-        <w:pStyle w:val="Heading1"/>
+        <w:pStyle w:val="Ttulo1"/>
       </w:pPr>
       <w:bookmarkStart w:id="17" w:name="_Toc213490210"/>
       <w:r>
@@ -3662,7 +3671,7 @@
     </w:p>
     <w:p>
       <w:pPr>
-        <w:pStyle w:val="Heading2"/>
+        <w:pStyle w:val="Ttulo2"/>
       </w:pPr>
       <w:bookmarkStart w:id="18" w:name="_Toc213490211"/>
       <w:r>
@@ -3842,7 +3851,7 @@
     </w:p>
     <w:p>
       <w:pPr>
-        <w:pStyle w:val="Heading2"/>
+        <w:pStyle w:val="Ttulo2"/>
       </w:pPr>
       <w:bookmarkStart w:id="19" w:name="_Toc213490212"/>
       <w:r>
@@ -4315,7 +4324,7 @@
         </w:tcPr>
         <w:p>
           <w:pPr>
-            <w:pStyle w:val="Header"/>
+            <w:pStyle w:val="Encabezado"/>
             <w:ind w:left="-251"/>
           </w:pPr>
           <w:r>
@@ -4373,7 +4382,7 @@
         </w:tcPr>
         <w:p>
           <w:pPr>
-            <w:pStyle w:val="Header"/>
+            <w:pStyle w:val="Encabezado"/>
             <w:jc w:val="center"/>
             <w:rPr>
               <w:sz w:val="22"/>
@@ -4388,7 +4397,7 @@
         </w:tcPr>
         <w:p>
           <w:pPr>
-            <w:pStyle w:val="Header"/>
+            <w:pStyle w:val="Encabezado"/>
             <w:ind w:right="-115"/>
             <w:jc w:val="both"/>
             <w:rPr>
@@ -4432,7 +4441,7 @@
         </w:p>
         <w:p>
           <w:pPr>
-            <w:pStyle w:val="Header"/>
+            <w:pStyle w:val="Encabezado"/>
             <w:ind w:right="-115"/>
             <w:jc w:val="right"/>
             <w:rPr>
@@ -4446,7 +4455,7 @@
   </w:tbl>
   <w:p>
     <w:pPr>
-      <w:pStyle w:val="Header"/>
+      <w:pStyle w:val="Encabezado"/>
     </w:pPr>
   </w:p>
 </w:hdr>
@@ -6682,7 +6691,7 @@
     <w:name w:val="Normal"/>
     <w:qFormat/>
   </w:style>
-  <w:style w:type="paragraph" w:styleId="Heading1">
+  <w:style w:type="paragraph" w:styleId="Ttulo1">
     <w:name w:val="heading 1"/>
     <w:basedOn w:val="Normal"/>
     <w:next w:val="Normal"/>
@@ -6702,7 +6711,7 @@
       <w:szCs w:val="52"/>
     </w:rPr>
   </w:style>
-  <w:style w:type="paragraph" w:styleId="Heading2">
+  <w:style w:type="paragraph" w:styleId="Ttulo2">
     <w:name w:val="heading 2"/>
     <w:basedOn w:val="Normal"/>
     <w:next w:val="Normal"/>
@@ -6722,7 +6731,7 @@
       <w:szCs w:val="40"/>
     </w:rPr>
   </w:style>
-  <w:style w:type="paragraph" w:styleId="Heading3">
+  <w:style w:type="paragraph" w:styleId="Ttulo3">
     <w:name w:val="heading 3"/>
     <w:basedOn w:val="Normal"/>
     <w:next w:val="Normal"/>
@@ -6741,7 +6750,7 @@
       <w:szCs w:val="32"/>
     </w:rPr>
   </w:style>
-  <w:style w:type="paragraph" w:styleId="Heading4">
+  <w:style w:type="paragraph" w:styleId="Ttulo4">
     <w:name w:val="heading 4"/>
     <w:basedOn w:val="Normal"/>
     <w:next w:val="Normal"/>
@@ -6761,7 +6770,7 @@
       <w:u w:val="single"/>
     </w:rPr>
   </w:style>
-  <w:style w:type="paragraph" w:styleId="Heading5">
+  <w:style w:type="paragraph" w:styleId="Ttulo5">
     <w:name w:val="heading 5"/>
     <w:basedOn w:val="Normal"/>
     <w:next w:val="Normal"/>
@@ -6781,7 +6790,7 @@
       <w:szCs w:val="22"/>
     </w:rPr>
   </w:style>
-  <w:style w:type="paragraph" w:styleId="Heading6">
+  <w:style w:type="paragraph" w:styleId="Ttulo6">
     <w:name w:val="heading 6"/>
     <w:basedOn w:val="Normal"/>
     <w:next w:val="Normal"/>
@@ -6802,13 +6811,13 @@
       <w:szCs w:val="22"/>
     </w:rPr>
   </w:style>
-  <w:style w:type="character" w:default="1" w:styleId="DefaultParagraphFont">
+  <w:style w:type="character" w:default="1" w:styleId="Fuentedeprrafopredeter">
     <w:name w:val="Default Paragraph Font"/>
     <w:uiPriority w:val="1"/>
     <w:semiHidden/>
     <w:unhideWhenUsed/>
   </w:style>
-  <w:style w:type="table" w:default="1" w:styleId="TableNormal">
+  <w:style w:type="table" w:default="1" w:styleId="Tablanormal">
     <w:name w:val="Normal Table"/>
     <w:uiPriority w:val="99"/>
     <w:semiHidden/>
@@ -6823,13 +6832,13 @@
       </w:tblCellMar>
     </w:tblPr>
   </w:style>
-  <w:style w:type="numbering" w:default="1" w:styleId="NoList">
+  <w:style w:type="numbering" w:default="1" w:styleId="Sinlista">
     <w:name w:val="No List"/>
     <w:uiPriority w:val="99"/>
     <w:semiHidden/>
     <w:unhideWhenUsed/>
   </w:style>
-  <w:style w:type="table" w:customStyle="1" w:styleId="TableNormal0">
+  <w:style w:type="table" w:customStyle="1" w:styleId="TableNormal">
     <w:name w:val="TableNormal"/>
     <w:tblPr>
       <w:tblCellMar>
@@ -6840,7 +6849,7 @@
       </w:tblCellMar>
     </w:tblPr>
   </w:style>
-  <w:style w:type="paragraph" w:styleId="Title">
+  <w:style w:type="paragraph" w:styleId="Ttulo">
     <w:name w:val="Title"/>
     <w:basedOn w:val="Normal"/>
     <w:next w:val="Normal"/>
@@ -6858,7 +6867,7 @@
       <w:szCs w:val="56"/>
     </w:rPr>
   </w:style>
-  <w:style w:type="paragraph" w:styleId="Subtitle">
+  <w:style w:type="paragraph" w:styleId="Subttulo">
     <w:name w:val="Subtitle"/>
     <w:basedOn w:val="Normal"/>
     <w:next w:val="Normal"/>
@@ -6877,7 +6886,7 @@
     </w:rPr>
   </w:style>
   <w:style w:type="table" w:customStyle="1" w:styleId="a">
-    <w:basedOn w:val="TableNormal0"/>
+    <w:basedOn w:val="TableNormal"/>
     <w:tblPr>
       <w:tblStyleRowBandSize w:val="1"/>
       <w:tblStyleColBandSize w:val="1"/>
@@ -6890,7 +6899,7 @@
     </w:tblPr>
   </w:style>
   <w:style w:type="table" w:customStyle="1" w:styleId="a0">
-    <w:basedOn w:val="TableNormal0"/>
+    <w:basedOn w:val="TableNormal"/>
     <w:tblPr>
       <w:tblStyleRowBandSize w:val="1"/>
       <w:tblStyleColBandSize w:val="1"/>
@@ -6902,10 +6911,10 @@
       </w:tblCellMar>
     </w:tblPr>
   </w:style>
-  <w:style w:type="paragraph" w:styleId="CommentText">
+  <w:style w:type="paragraph" w:styleId="Textocomentario">
     <w:name w:val="annotation text"/>
     <w:basedOn w:val="Normal"/>
-    <w:link w:val="CommentTextChar"/>
+    <w:link w:val="TextocomentarioCar"/>
     <w:uiPriority w:val="99"/>
     <w:semiHidden/>
     <w:unhideWhenUsed/>
@@ -6917,10 +6926,10 @@
       <w:szCs w:val="20"/>
     </w:rPr>
   </w:style>
-  <w:style w:type="character" w:customStyle="1" w:styleId="CommentTextChar">
-    <w:name w:val="Comment Text Char"/>
-    <w:basedOn w:val="DefaultParagraphFont"/>
-    <w:link w:val="CommentText"/>
+  <w:style w:type="character" w:customStyle="1" w:styleId="TextocomentarioCar">
+    <w:name w:val="Texto comentario Car"/>
+    <w:basedOn w:val="Fuentedeprrafopredeter"/>
+    <w:link w:val="Textocomentario"/>
     <w:uiPriority w:val="99"/>
     <w:semiHidden/>
     <w:rPr>
@@ -6928,9 +6937,9 @@
       <w:szCs w:val="20"/>
     </w:rPr>
   </w:style>
-  <w:style w:type="character" w:styleId="CommentReference">
+  <w:style w:type="character" w:styleId="Refdecomentario">
     <w:name w:val="annotation reference"/>
-    <w:basedOn w:val="DefaultParagraphFont"/>
+    <w:basedOn w:val="Fuentedeprrafopredeter"/>
     <w:uiPriority w:val="99"/>
     <w:semiHidden/>
     <w:unhideWhenUsed/>
@@ -6939,7 +6948,7 @@
       <w:szCs w:val="16"/>
     </w:rPr>
   </w:style>
-  <w:style w:type="paragraph" w:styleId="ListParagraph">
+  <w:style w:type="paragraph" w:styleId="Prrafodelista">
     <w:name w:val="List Paragraph"/>
     <w:basedOn w:val="Normal"/>
     <w:uiPriority w:val="34"/>
@@ -6950,10 +6959,10 @@
       <w:contextualSpacing/>
     </w:pPr>
   </w:style>
-  <w:style w:type="paragraph" w:styleId="Header">
+  <w:style w:type="paragraph" w:styleId="Encabezado">
     <w:name w:val="header"/>
     <w:basedOn w:val="Normal"/>
-    <w:link w:val="HeaderChar"/>
+    <w:link w:val="EncabezadoCar"/>
     <w:uiPriority w:val="99"/>
     <w:unhideWhenUsed/>
     <w:rsid w:val="006E522E"/>
@@ -6965,17 +6974,17 @@
       <w:spacing w:line="240" w:lineRule="auto"/>
     </w:pPr>
   </w:style>
-  <w:style w:type="character" w:customStyle="1" w:styleId="HeaderChar">
-    <w:name w:val="Header Char"/>
-    <w:basedOn w:val="DefaultParagraphFont"/>
-    <w:link w:val="Header"/>
+  <w:style w:type="character" w:customStyle="1" w:styleId="EncabezadoCar">
+    <w:name w:val="Encabezado Car"/>
+    <w:basedOn w:val="Fuentedeprrafopredeter"/>
+    <w:link w:val="Encabezado"/>
     <w:uiPriority w:val="99"/>
     <w:rsid w:val="006E522E"/>
   </w:style>
-  <w:style w:type="paragraph" w:styleId="Footer">
+  <w:style w:type="paragraph" w:styleId="Piedepgina">
     <w:name w:val="footer"/>
     <w:basedOn w:val="Normal"/>
-    <w:link w:val="FooterChar"/>
+    <w:link w:val="PiedepginaCar"/>
     <w:uiPriority w:val="99"/>
     <w:unhideWhenUsed/>
     <w:rsid w:val="006E522E"/>
@@ -6987,16 +6996,16 @@
       <w:spacing w:line="240" w:lineRule="auto"/>
     </w:pPr>
   </w:style>
-  <w:style w:type="character" w:customStyle="1" w:styleId="FooterChar">
-    <w:name w:val="Footer Char"/>
-    <w:basedOn w:val="DefaultParagraphFont"/>
-    <w:link w:val="Footer"/>
+  <w:style w:type="character" w:customStyle="1" w:styleId="PiedepginaCar">
+    <w:name w:val="Pie de página Car"/>
+    <w:basedOn w:val="Fuentedeprrafopredeter"/>
+    <w:link w:val="Piedepgina"/>
     <w:uiPriority w:val="99"/>
     <w:rsid w:val="006E522E"/>
   </w:style>
-  <w:style w:type="paragraph" w:styleId="TOCHeading">
+  <w:style w:type="paragraph" w:styleId="TtuloTDC">
     <w:name w:val="TOC Heading"/>
-    <w:basedOn w:val="Heading1"/>
+    <w:basedOn w:val="Ttulo1"/>
     <w:next w:val="Normal"/>
     <w:uiPriority w:val="39"/>
     <w:unhideWhenUsed/>
@@ -7015,7 +7024,7 @@
       <w:lang w:val="en-US"/>
     </w:rPr>
   </w:style>
-  <w:style w:type="paragraph" w:styleId="TOC1">
+  <w:style w:type="paragraph" w:styleId="TDC1">
     <w:name w:val="toc 1"/>
     <w:basedOn w:val="Normal"/>
     <w:next w:val="Normal"/>
@@ -7027,7 +7036,7 @@
       <w:spacing w:after="100"/>
     </w:pPr>
   </w:style>
-  <w:style w:type="paragraph" w:styleId="TOC2">
+  <w:style w:type="paragraph" w:styleId="TDC2">
     <w:name w:val="toc 2"/>
     <w:basedOn w:val="Normal"/>
     <w:next w:val="Normal"/>
@@ -7040,9 +7049,9 @@
       <w:ind w:left="240"/>
     </w:pPr>
   </w:style>
-  <w:style w:type="character" w:styleId="Hyperlink">
+  <w:style w:type="character" w:styleId="Hipervnculo">
     <w:name w:val="Hyperlink"/>
-    <w:basedOn w:val="DefaultParagraphFont"/>
+    <w:basedOn w:val="Fuentedeprrafopredeter"/>
     <w:uiPriority w:val="99"/>
     <w:unhideWhenUsed/>
     <w:rsid w:val="00674AA6"/>

</xml_diff>